<commit_message>
Tableros preliminares en power bi. Fases 1 a 8 del Proyecto
</commit_message>
<xml_diff>
--- a/docs/etapas.docx
+++ b/docs/etapas.docx
@@ -12,20 +12,1727 @@
         <w:rPr>
           <w:lang w:val="es-AR"/>
         </w:rPr>
+        <w:t>"</w:t>
+      </w:r>
+      <w:proofErr w:type="spellStart"/>
+      <w:r>
+        <w:rPr>
+          <w:lang w:val="es-AR"/>
+        </w:rPr>
+        <w:t>RetailIQ</w:t>
+      </w:r>
+      <w:proofErr w:type="spellEnd"/>
+      <w:r>
+        <w:rPr>
+          <w:lang w:val="es-AR"/>
+        </w:rPr>
+        <w:t xml:space="preserve"> 360°: Plataforma de Inteligencia Comercial </w:t>
+      </w:r>
+      <w:proofErr w:type="spellStart"/>
+      <w:r>
+        <w:rPr>
+          <w:lang w:val="es-AR"/>
+        </w:rPr>
+        <w:t>Omnicanal</w:t>
+      </w:r>
+      <w:proofErr w:type="spellEnd"/>
+      <w:r>
+        <w:rPr>
+          <w:lang w:val="es-AR"/>
+        </w:rPr>
+        <w:t xml:space="preserve"> — Análisis de Ventas, </w:t>
+      </w:r>
+      <w:proofErr w:type="spellStart"/>
+      <w:r>
+        <w:rPr>
+          <w:lang w:val="es-AR"/>
+        </w:rPr>
+        <w:t>Pricing</w:t>
+      </w:r>
+      <w:proofErr w:type="spellEnd"/>
+      <w:r>
+        <w:rPr>
+          <w:lang w:val="es-AR"/>
+        </w:rPr>
+        <w:t xml:space="preserve"> Dinámico y Estrategia de Cross-Selling para el Mercado Argentino"</w:t>
+      </w:r>
+    </w:p>
+    <w:p>
+      <w:pPr>
+        <w:rPr>
+          <w:lang w:val="es-AR"/>
+        </w:rPr>
+      </w:pPr>
+      <w:r>
+        <w:rPr>
+          <w:lang w:val="es-AR"/>
+        </w:rPr>
+        <w:t xml:space="preserve">Un sistema analítico </w:t>
+      </w:r>
+      <w:proofErr w:type="spellStart"/>
+      <w:r>
+        <w:rPr>
+          <w:lang w:val="es-AR"/>
+        </w:rPr>
+        <w:t>end-to-end</w:t>
+      </w:r>
+      <w:proofErr w:type="spellEnd"/>
+      <w:r>
+        <w:rPr>
+          <w:lang w:val="es-AR"/>
+        </w:rPr>
+        <w:t xml:space="preserve"> que integra el canal físico y el e-</w:t>
+      </w:r>
+      <w:proofErr w:type="spellStart"/>
+      <w:r>
+        <w:rPr>
+          <w:lang w:val="es-AR"/>
+        </w:rPr>
+        <w:t>commerce</w:t>
+      </w:r>
+      <w:proofErr w:type="spellEnd"/>
+      <w:r>
+        <w:rPr>
+          <w:lang w:val="es-AR"/>
+        </w:rPr>
+        <w:t xml:space="preserve"> de una cadena </w:t>
+      </w:r>
+      <w:proofErr w:type="spellStart"/>
+      <w:r>
+        <w:rPr>
+          <w:lang w:val="es-AR"/>
+        </w:rPr>
+        <w:t>retail</w:t>
+      </w:r>
+      <w:proofErr w:type="spellEnd"/>
+      <w:r>
+        <w:rPr>
+          <w:lang w:val="es-AR"/>
+        </w:rPr>
+        <w:t xml:space="preserve"> argentina, combinando análisis de ventas clásico con inteligencia de precios competitiva y modelos de afinidad de productos para maximizar el </w:t>
+      </w:r>
+      <w:proofErr w:type="gramStart"/>
+      <w:r>
+        <w:rPr>
+          <w:lang w:val="es-AR"/>
+        </w:rPr>
+        <w:t>ticket</w:t>
+      </w:r>
+      <w:proofErr w:type="gramEnd"/>
+      <w:r>
+        <w:rPr>
+          <w:lang w:val="es-AR"/>
+        </w:rPr>
+        <w:t xml:space="preserve"> promedio y la rentabilidad real.</w:t>
+      </w:r>
+    </w:p>
+    <w:tbl>
+      <w:tblPr>
+        <w:tblW w:w="10156" w:type="dxa"/>
+        <w:tblCellMar>
+          <w:left w:w="0" w:type="dxa"/>
+          <w:right w:w="0" w:type="dxa"/>
+        </w:tblCellMar>
+        <w:tblLook w:val="04A0" w:firstRow="1" w:lastRow="0" w:firstColumn="1" w:lastColumn="0" w:noHBand="0" w:noVBand="1"/>
+      </w:tblPr>
+      <w:tblGrid>
+        <w:gridCol w:w="3453"/>
+        <w:gridCol w:w="6703"/>
+      </w:tblGrid>
+      <w:tr>
+        <w:tc>
+          <w:tcPr>
+            <w:tcW w:w="3453" w:type="dxa"/>
+            <w:tcMar>
+              <w:top w:w="90" w:type="dxa"/>
+              <w:left w:w="90" w:type="dxa"/>
+              <w:bottom w:w="90" w:type="dxa"/>
+              <w:right w:w="90" w:type="dxa"/>
+            </w:tcMar>
+            <w:hideMark/>
+          </w:tcPr>
+          <w:p>
+            <w:r>
+              <w:t xml:space="preserve">Tagline </w:t>
+            </w:r>
+            <w:proofErr w:type="spellStart"/>
+            <w:r>
+              <w:t>académico</w:t>
+            </w:r>
+            <w:proofErr w:type="spellEnd"/>
+          </w:p>
+        </w:tc>
+        <w:tc>
+          <w:tcPr>
+            <w:tcW w:w="0" w:type="auto"/>
+            <w:tcMar>
+              <w:top w:w="90" w:type="dxa"/>
+              <w:left w:w="90" w:type="dxa"/>
+              <w:bottom w:w="90" w:type="dxa"/>
+              <w:right w:w="90" w:type="dxa"/>
+            </w:tcMar>
+            <w:hideMark/>
+          </w:tcPr>
+          <w:p>
+            <w:pPr>
+              <w:rPr>
+                <w:lang w:val="es-AR"/>
+              </w:rPr>
+            </w:pPr>
+            <w:r>
+              <w:rPr>
+                <w:i/>
+                <w:iCs/>
+                <w:lang w:val="es-AR"/>
+              </w:rPr>
+              <w:t xml:space="preserve">"De los datos de caja al algoritmo de precios: un modelo analítico </w:t>
+            </w:r>
+            <w:proofErr w:type="spellStart"/>
+            <w:r>
+              <w:rPr>
+                <w:i/>
+                <w:iCs/>
+                <w:lang w:val="es-AR"/>
+              </w:rPr>
+              <w:t>omnicanal</w:t>
+            </w:r>
+            <w:proofErr w:type="spellEnd"/>
+            <w:r>
+              <w:rPr>
+                <w:i/>
+                <w:iCs/>
+                <w:lang w:val="es-AR"/>
+              </w:rPr>
+              <w:t xml:space="preserve"> con DAX avanzado, modelado relacional y lógica de negocio real"</w:t>
+            </w:r>
+          </w:p>
+        </w:tc>
+      </w:tr>
+      <w:tr>
+        <w:tc>
+          <w:tcPr>
+            <w:tcW w:w="3453" w:type="dxa"/>
+            <w:tcMar>
+              <w:top w:w="90" w:type="dxa"/>
+              <w:left w:w="90" w:type="dxa"/>
+              <w:bottom w:w="90" w:type="dxa"/>
+              <w:right w:w="90" w:type="dxa"/>
+            </w:tcMar>
+            <w:hideMark/>
+          </w:tcPr>
+          <w:p>
+            <w:r>
+              <w:t xml:space="preserve">Caso de </w:t>
+            </w:r>
+            <w:proofErr w:type="spellStart"/>
+            <w:r>
+              <w:t>uso</w:t>
+            </w:r>
+            <w:proofErr w:type="spellEnd"/>
+          </w:p>
+        </w:tc>
+        <w:tc>
+          <w:tcPr>
+            <w:tcW w:w="0" w:type="auto"/>
+            <w:tcMar>
+              <w:top w:w="90" w:type="dxa"/>
+              <w:left w:w="90" w:type="dxa"/>
+              <w:bottom w:w="90" w:type="dxa"/>
+              <w:right w:w="90" w:type="dxa"/>
+            </w:tcMar>
+            <w:hideMark/>
+          </w:tcPr>
+          <w:p>
+            <w:pPr>
+              <w:rPr>
+                <w:lang w:val="es-AR"/>
+              </w:rPr>
+            </w:pPr>
+            <w:r>
+              <w:rPr>
+                <w:lang w:val="es-AR"/>
+              </w:rPr>
+              <w:t xml:space="preserve">Cadena </w:t>
+            </w:r>
+            <w:proofErr w:type="spellStart"/>
+            <w:r>
+              <w:rPr>
+                <w:lang w:val="es-AR"/>
+              </w:rPr>
+              <w:t>retail</w:t>
+            </w:r>
+            <w:proofErr w:type="spellEnd"/>
+            <w:r>
+              <w:rPr>
+                <w:lang w:val="es-AR"/>
+              </w:rPr>
+              <w:t xml:space="preserve"> argentina con tiendas físicas + </w:t>
+            </w:r>
+            <w:proofErr w:type="spellStart"/>
+            <w:r>
+              <w:rPr>
+                <w:lang w:val="es-AR"/>
+              </w:rPr>
+              <w:t>marketplace</w:t>
+            </w:r>
+            <w:proofErr w:type="spellEnd"/>
+            <w:r>
+              <w:rPr>
+                <w:lang w:val="es-AR"/>
+              </w:rPr>
+              <w:t xml:space="preserve"> propio online. Ej. modelo inspirado en </w:t>
+            </w:r>
+            <w:proofErr w:type="spellStart"/>
+            <w:r>
+              <w:rPr>
+                <w:lang w:val="es-AR"/>
+              </w:rPr>
+              <w:t>Frávega</w:t>
+            </w:r>
+            <w:proofErr w:type="spellEnd"/>
+            <w:r>
+              <w:rPr>
+                <w:lang w:val="es-AR"/>
+              </w:rPr>
+              <w:t>, Garbarino, Easy o supermercado cadena — sin nombrar ninguno en el trabajo.</w:t>
+            </w:r>
+          </w:p>
+        </w:tc>
+      </w:tr>
+      <w:tr>
+        <w:tc>
+          <w:tcPr>
+            <w:tcW w:w="3453" w:type="dxa"/>
+            <w:tcMar>
+              <w:top w:w="90" w:type="dxa"/>
+              <w:left w:w="90" w:type="dxa"/>
+              <w:bottom w:w="90" w:type="dxa"/>
+              <w:right w:w="90" w:type="dxa"/>
+            </w:tcMar>
+            <w:hideMark/>
+          </w:tcPr>
+          <w:p>
+            <w:proofErr w:type="spellStart"/>
+            <w:r>
+              <w:t>Pregunta</w:t>
+            </w:r>
+            <w:proofErr w:type="spellEnd"/>
+            <w:r>
+              <w:t xml:space="preserve"> de </w:t>
+            </w:r>
+            <w:proofErr w:type="spellStart"/>
+            <w:r>
+              <w:t>negocio</w:t>
+            </w:r>
+            <w:proofErr w:type="spellEnd"/>
+            <w:r>
+              <w:t xml:space="preserve"> central</w:t>
+            </w:r>
+          </w:p>
+        </w:tc>
+        <w:tc>
+          <w:tcPr>
+            <w:tcW w:w="0" w:type="auto"/>
+            <w:tcMar>
+              <w:top w:w="90" w:type="dxa"/>
+              <w:left w:w="90" w:type="dxa"/>
+              <w:bottom w:w="90" w:type="dxa"/>
+              <w:right w:w="90" w:type="dxa"/>
+            </w:tcMar>
+            <w:hideMark/>
+          </w:tcPr>
+          <w:p>
+            <w:pPr>
+              <w:rPr>
+                <w:lang w:val="es-AR"/>
+              </w:rPr>
+            </w:pPr>
+            <w:r>
+              <w:rPr>
+                <w:lang w:val="es-AR"/>
+              </w:rPr>
+              <w:t>¿Cómo maximizar la rentabilidad por canal ajustando precios y recomendando productos complementarios, en un contexto de demanda variable y múltiples puntos de venta?</w:t>
+            </w:r>
+          </w:p>
+        </w:tc>
+      </w:tr>
+      <w:tr>
+        <w:tc>
+          <w:tcPr>
+            <w:tcW w:w="3453" w:type="dxa"/>
+            <w:tcMar>
+              <w:top w:w="90" w:type="dxa"/>
+              <w:left w:w="90" w:type="dxa"/>
+              <w:bottom w:w="90" w:type="dxa"/>
+              <w:right w:w="90" w:type="dxa"/>
+            </w:tcMar>
+            <w:hideMark/>
+          </w:tcPr>
+          <w:p>
+            <w:r>
+              <w:t>Datasets base</w:t>
+            </w:r>
+          </w:p>
+        </w:tc>
+        <w:tc>
+          <w:tcPr>
+            <w:tcW w:w="0" w:type="auto"/>
+            <w:tcMar>
+              <w:top w:w="90" w:type="dxa"/>
+              <w:left w:w="90" w:type="dxa"/>
+              <w:bottom w:w="90" w:type="dxa"/>
+              <w:right w:w="90" w:type="dxa"/>
+            </w:tcMar>
+            <w:hideMark/>
+          </w:tcPr>
+          <w:p>
+            <w:proofErr w:type="spellStart"/>
+            <w:r>
+              <w:t>Olist</w:t>
+            </w:r>
+            <w:proofErr w:type="spellEnd"/>
+            <w:r>
+              <w:t xml:space="preserve"> BR E-Commerce (Kaggle) Superstore Sales (Kaggle) INDEC IPC (</w:t>
+            </w:r>
+            <w:proofErr w:type="spellStart"/>
+            <w:r>
+              <w:t>opcional</w:t>
+            </w:r>
+            <w:proofErr w:type="spellEnd"/>
+            <w:r>
+              <w:t>) </w:t>
+            </w:r>
+            <w:proofErr w:type="spellStart"/>
+            <w:r>
+              <w:t>Sintético</w:t>
+            </w:r>
+            <w:proofErr w:type="spellEnd"/>
+            <w:r>
+              <w:t xml:space="preserve"> </w:t>
+            </w:r>
+            <w:proofErr w:type="spellStart"/>
+            <w:r>
+              <w:t>localizado</w:t>
+            </w:r>
+            <w:proofErr w:type="spellEnd"/>
+            <w:r>
+              <w:t xml:space="preserve"> AR</w:t>
+            </w:r>
+          </w:p>
+        </w:tc>
+      </w:tr>
+      <w:tr>
+        <w:tc>
+          <w:tcPr>
+            <w:tcW w:w="3453" w:type="dxa"/>
+            <w:tcMar>
+              <w:top w:w="90" w:type="dxa"/>
+              <w:left w:w="90" w:type="dxa"/>
+              <w:bottom w:w="90" w:type="dxa"/>
+              <w:right w:w="90" w:type="dxa"/>
+            </w:tcMar>
+            <w:hideMark/>
+          </w:tcPr>
+          <w:p>
+            <w:r>
+              <w:t xml:space="preserve">¿Datos </w:t>
+            </w:r>
+            <w:proofErr w:type="spellStart"/>
+            <w:r>
+              <w:t>sintéticos</w:t>
+            </w:r>
+            <w:proofErr w:type="spellEnd"/>
+            <w:r>
+              <w:t>?</w:t>
+            </w:r>
+          </w:p>
+        </w:tc>
+        <w:tc>
+          <w:tcPr>
+            <w:tcW w:w="0" w:type="auto"/>
+            <w:tcMar>
+              <w:top w:w="90" w:type="dxa"/>
+              <w:left w:w="90" w:type="dxa"/>
+              <w:bottom w:w="90" w:type="dxa"/>
+              <w:right w:w="90" w:type="dxa"/>
+            </w:tcMar>
+            <w:hideMark/>
+          </w:tcPr>
+          <w:p>
+            <w:r>
+              <w:rPr>
+                <w:lang w:val="es-AR"/>
+              </w:rPr>
+              <w:t xml:space="preserve">Sí, parciales: se genera una capa de localización argentina (provincias, ciudades, sucursales ficticias, precios en ARS) sobre los </w:t>
+            </w:r>
+            <w:proofErr w:type="spellStart"/>
+            <w:r>
+              <w:rPr>
+                <w:lang w:val="es-AR"/>
+              </w:rPr>
+              <w:t>datasets</w:t>
+            </w:r>
+            <w:proofErr w:type="spellEnd"/>
+            <w:r>
+              <w:rPr>
+                <w:lang w:val="es-AR"/>
+              </w:rPr>
+              <w:t xml:space="preserve"> base reales de </w:t>
+            </w:r>
+            <w:proofErr w:type="spellStart"/>
+            <w:r>
+              <w:rPr>
+                <w:lang w:val="es-AR"/>
+              </w:rPr>
+              <w:t>Kaggle</w:t>
+            </w:r>
+            <w:proofErr w:type="spellEnd"/>
+            <w:r>
+              <w:rPr>
+                <w:lang w:val="es-AR"/>
+              </w:rPr>
+              <w:t xml:space="preserve">. </w:t>
+            </w:r>
+            <w:r>
+              <w:t xml:space="preserve">El script Python de </w:t>
+            </w:r>
+            <w:proofErr w:type="spellStart"/>
+            <w:r>
+              <w:t>generación</w:t>
+            </w:r>
+            <w:proofErr w:type="spellEnd"/>
+            <w:r>
+              <w:t xml:space="preserve"> forma </w:t>
+            </w:r>
+            <w:proofErr w:type="spellStart"/>
+            <w:r>
+              <w:t>parte</w:t>
+            </w:r>
+            <w:proofErr w:type="spellEnd"/>
+            <w:r>
+              <w:t xml:space="preserve"> del </w:t>
+            </w:r>
+            <w:proofErr w:type="spellStart"/>
+            <w:r>
+              <w:t>entregable</w:t>
+            </w:r>
+            <w:proofErr w:type="spellEnd"/>
+            <w:r>
+              <w:t>.</w:t>
+            </w:r>
+          </w:p>
+        </w:tc>
+      </w:tr>
+      <w:tr>
+        <w:tc>
+          <w:tcPr>
+            <w:tcW w:w="3453" w:type="dxa"/>
+            <w:tcMar>
+              <w:top w:w="90" w:type="dxa"/>
+              <w:left w:w="90" w:type="dxa"/>
+              <w:bottom w:w="90" w:type="dxa"/>
+              <w:right w:w="90" w:type="dxa"/>
+            </w:tcMar>
+            <w:hideMark/>
+          </w:tcPr>
+          <w:p>
+            <w:proofErr w:type="spellStart"/>
+            <w:r>
+              <w:t>Complejidad</w:t>
+            </w:r>
+            <w:proofErr w:type="spellEnd"/>
+            <w:r>
+              <w:t xml:space="preserve"> total</w:t>
+            </w:r>
+          </w:p>
+        </w:tc>
+        <w:tc>
+          <w:tcPr>
+            <w:tcW w:w="0" w:type="auto"/>
+            <w:tcMar>
+              <w:top w:w="90" w:type="dxa"/>
+              <w:left w:w="90" w:type="dxa"/>
+              <w:bottom w:w="90" w:type="dxa"/>
+              <w:right w:w="90" w:type="dxa"/>
+            </w:tcMar>
+            <w:hideMark/>
+          </w:tcPr>
+          <w:p>
+            <w:pPr>
+              <w:rPr>
+                <w:lang w:val="es-AR"/>
+              </w:rPr>
+            </w:pPr>
+            <w:r>
+              <w:rPr>
+                <w:rFonts w:ascii="Segoe UI Symbol" w:hAnsi="Segoe UI Symbol" w:cs="Segoe UI Symbol"/>
+                <w:lang w:val="es-AR"/>
+              </w:rPr>
+              <w:t>★★★★★</w:t>
+            </w:r>
+            <w:r>
+              <w:rPr>
+                <w:rFonts w:ascii="Aptos" w:hAnsi="Aptos" w:cs="Aptos"/>
+                <w:lang w:val="es-AR"/>
+              </w:rPr>
+              <w:t> —</w:t>
+            </w:r>
+            <w:r>
+              <w:rPr>
+                <w:lang w:val="es-AR"/>
+              </w:rPr>
+              <w:t xml:space="preserve"> M</w:t>
+            </w:r>
+            <w:r>
+              <w:rPr>
+                <w:rFonts w:ascii="Aptos" w:hAnsi="Aptos" w:cs="Aptos"/>
+                <w:lang w:val="es-AR"/>
+              </w:rPr>
+              <w:t>á</w:t>
+            </w:r>
+            <w:r>
+              <w:rPr>
+                <w:lang w:val="es-AR"/>
+              </w:rPr>
+              <w:t xml:space="preserve">xima para tecnicatura </w:t>
+            </w:r>
+            <w:r>
+              <w:rPr>
+                <w:rFonts w:ascii="Aptos" w:hAnsi="Aptos" w:cs="Aptos"/>
+                <w:lang w:val="es-AR"/>
+              </w:rPr>
+              <w:t>·</w:t>
+            </w:r>
+            <w:r>
+              <w:rPr>
+                <w:lang w:val="es-AR"/>
+              </w:rPr>
+              <w:t xml:space="preserve"> diferenciador claro de </w:t>
+            </w:r>
+            <w:proofErr w:type="gramStart"/>
+            <w:r>
+              <w:rPr>
+                <w:lang w:val="es-AR"/>
+              </w:rPr>
+              <w:t>portfolio</w:t>
+            </w:r>
+            <w:proofErr w:type="gramEnd"/>
+          </w:p>
+        </w:tc>
+      </w:tr>
+    </w:tbl>
+    <w:p>
+      <w:pPr>
+        <w:rPr>
+          <w:lang w:val="es-AR"/>
+        </w:rPr>
+      </w:pPr>
+      <w:r>
+        <w:rPr>
+          <w:lang w:val="es-AR"/>
+        </w:rPr>
+        <w:t>Los 4 módulos analíticos del proyecto</w:t>
+      </w:r>
+    </w:p>
+    <w:p>
+      <w:pPr>
+        <w:rPr>
+          <w:lang w:val="es-AR"/>
+        </w:rPr>
+      </w:pPr>
+      <w:r>
+        <w:rPr>
+          <w:lang w:val="es-AR"/>
+        </w:rPr>
+        <w:t xml:space="preserve">Módulo 1 · Ventas &amp; Performance </w:t>
+      </w:r>
+      <w:proofErr w:type="spellStart"/>
+      <w:r>
+        <w:rPr>
+          <w:lang w:val="es-AR"/>
+        </w:rPr>
+        <w:t>Omnicanal</w:t>
+      </w:r>
+      <w:proofErr w:type="spellEnd"/>
+    </w:p>
+    <w:p>
+      <w:pPr>
+        <w:rPr>
+          <w:lang w:val="es-AR"/>
+        </w:rPr>
+      </w:pPr>
+      <w:r>
+        <w:rPr>
+          <w:lang w:val="es-AR"/>
+        </w:rPr>
+        <w:t xml:space="preserve">Análisis clásico pero robusto: ventas por canal (físico vs online), por región, por categoría y en el tiempo. Tendencias, estacionalidad, variación interanual. Base del modelo estrella. </w:t>
+      </w:r>
+      <w:proofErr w:type="spellStart"/>
+      <w:r>
+        <w:rPr>
+          <w:lang w:val="es-AR"/>
+        </w:rPr>
+        <w:t>KPIs</w:t>
+      </w:r>
+      <w:proofErr w:type="spellEnd"/>
+      <w:r>
+        <w:rPr>
+          <w:lang w:val="es-AR"/>
+        </w:rPr>
+        <w:t xml:space="preserve">: </w:t>
+      </w:r>
+      <w:proofErr w:type="spellStart"/>
+      <w:r>
+        <w:rPr>
+          <w:lang w:val="es-AR"/>
+        </w:rPr>
+        <w:t>revenue</w:t>
+      </w:r>
+      <w:proofErr w:type="spellEnd"/>
+      <w:r>
+        <w:rPr>
+          <w:lang w:val="es-AR"/>
+        </w:rPr>
+        <w:t xml:space="preserve"> total, </w:t>
+      </w:r>
+      <w:proofErr w:type="gramStart"/>
+      <w:r>
+        <w:rPr>
+          <w:lang w:val="es-AR"/>
+        </w:rPr>
+        <w:t>ticket</w:t>
+      </w:r>
+      <w:proofErr w:type="gramEnd"/>
+      <w:r>
+        <w:rPr>
+          <w:lang w:val="es-AR"/>
+        </w:rPr>
+        <w:t xml:space="preserve"> promedio, unidades vendidas, devoluciones, margen bruto por canal.</w:t>
+      </w:r>
+    </w:p>
+    <w:p>
+      <w:pPr>
+        <w:rPr>
+          <w:lang w:val="es-AR"/>
+        </w:rPr>
+      </w:pPr>
+      <w:r>
+        <w:rPr>
+          <w:lang w:val="es-AR"/>
+        </w:rPr>
+        <w:lastRenderedPageBreak/>
+        <w:t>Módulo 2 · Inteligencia de Precios &amp; Competitividad</w:t>
+      </w:r>
+    </w:p>
+    <w:p>
+      <w:pPr>
+        <w:rPr>
+          <w:lang w:val="es-AR"/>
+        </w:rPr>
+      </w:pPr>
+      <w:r>
+        <w:rPr>
+          <w:lang w:val="es-AR"/>
+        </w:rPr>
+        <w:t xml:space="preserve">Análisis de posicionamiento de precios por </w:t>
+      </w:r>
+      <w:proofErr w:type="spellStart"/>
+      <w:r>
+        <w:rPr>
+          <w:lang w:val="es-AR"/>
+        </w:rPr>
+        <w:t>SKU</w:t>
+      </w:r>
+      <w:proofErr w:type="spellEnd"/>
+      <w:r>
+        <w:rPr>
+          <w:lang w:val="es-AR"/>
+        </w:rPr>
+        <w:t xml:space="preserve"> y categoría. Elasticidad precio-demanda simplificada. Detección de productos con precio fuera de rango óptimo. Comparación entre precio de lista, precio real de venta y precio de competencia (simulado). </w:t>
+      </w:r>
+      <w:proofErr w:type="spellStart"/>
+      <w:r>
+        <w:rPr>
+          <w:lang w:val="es-AR"/>
+        </w:rPr>
+        <w:t>KPIs</w:t>
+      </w:r>
+      <w:proofErr w:type="spellEnd"/>
+      <w:r>
+        <w:rPr>
+          <w:lang w:val="es-AR"/>
+        </w:rPr>
+        <w:t xml:space="preserve">: </w:t>
+      </w:r>
+      <w:proofErr w:type="spellStart"/>
+      <w:r>
+        <w:rPr>
+          <w:lang w:val="es-AR"/>
+        </w:rPr>
+        <w:t>price</w:t>
+      </w:r>
+      <w:proofErr w:type="spellEnd"/>
+      <w:r>
+        <w:rPr>
+          <w:lang w:val="es-AR"/>
+        </w:rPr>
+        <w:t xml:space="preserve"> </w:t>
+      </w:r>
+      <w:proofErr w:type="spellStart"/>
+      <w:r>
+        <w:rPr>
+          <w:lang w:val="es-AR"/>
+        </w:rPr>
+        <w:t>index</w:t>
+      </w:r>
+      <w:proofErr w:type="spellEnd"/>
+      <w:r>
+        <w:rPr>
+          <w:lang w:val="es-AR"/>
+        </w:rPr>
+        <w:t xml:space="preserve">, descuento promedio, margen por rango de precio, </w:t>
+      </w:r>
+      <w:proofErr w:type="spellStart"/>
+      <w:r>
+        <w:rPr>
+          <w:lang w:val="es-AR"/>
+        </w:rPr>
+        <w:t>sell-through</w:t>
+      </w:r>
+      <w:proofErr w:type="spellEnd"/>
+      <w:r>
+        <w:rPr>
+          <w:lang w:val="es-AR"/>
+        </w:rPr>
+        <w:t xml:space="preserve"> </w:t>
+      </w:r>
+      <w:proofErr w:type="spellStart"/>
+      <w:r>
+        <w:rPr>
+          <w:lang w:val="es-AR"/>
+        </w:rPr>
+        <w:t>rate</w:t>
+      </w:r>
+      <w:proofErr w:type="spellEnd"/>
+      <w:r>
+        <w:rPr>
+          <w:lang w:val="es-AR"/>
+        </w:rPr>
+        <w:t>.</w:t>
+      </w:r>
+    </w:p>
+    <w:p>
+      <w:pPr>
+        <w:rPr>
+          <w:lang w:val="es-AR"/>
+        </w:rPr>
+      </w:pPr>
+      <w:r>
+        <w:rPr>
+          <w:lang w:val="es-AR"/>
+        </w:rPr>
+        <w:t>Módulo 3 · Cross-Selling &amp; Afinidad de Productos</w:t>
+      </w:r>
+    </w:p>
+    <w:p>
+      <w:pPr>
+        <w:rPr>
+          <w:lang w:val="es-AR"/>
+        </w:rPr>
+      </w:pPr>
+      <w:r>
+        <w:rPr>
+          <w:lang w:val="es-AR"/>
+        </w:rPr>
+        <w:t xml:space="preserve">Análisis de canasta de compra: qué productos se compran juntos, en qué secuencia y en qué canal. Market </w:t>
+      </w:r>
+      <w:proofErr w:type="spellStart"/>
+      <w:r>
+        <w:rPr>
+          <w:lang w:val="es-AR"/>
+        </w:rPr>
+        <w:t>basket</w:t>
+      </w:r>
+      <w:proofErr w:type="spellEnd"/>
+      <w:r>
+        <w:rPr>
+          <w:lang w:val="es-AR"/>
+        </w:rPr>
+        <w:t xml:space="preserve"> </w:t>
+      </w:r>
+      <w:proofErr w:type="spellStart"/>
+      <w:r>
+        <w:rPr>
+          <w:lang w:val="es-AR"/>
+        </w:rPr>
+        <w:t>analysis</w:t>
+      </w:r>
+      <w:proofErr w:type="spellEnd"/>
+      <w:r>
+        <w:rPr>
+          <w:lang w:val="es-AR"/>
+        </w:rPr>
+        <w:t xml:space="preserve"> simplificado (reglas de asociación calculadas en Python, visualizadas en Power BI). </w:t>
+      </w:r>
+      <w:proofErr w:type="spellStart"/>
+      <w:r>
+        <w:rPr>
+          <w:lang w:val="es-AR"/>
+        </w:rPr>
+        <w:t>KPIs</w:t>
+      </w:r>
+      <w:proofErr w:type="spellEnd"/>
+      <w:r>
+        <w:rPr>
+          <w:lang w:val="es-AR"/>
+        </w:rPr>
+        <w:t xml:space="preserve">: </w:t>
+      </w:r>
+      <w:proofErr w:type="spellStart"/>
+      <w:r>
+        <w:rPr>
+          <w:lang w:val="es-AR"/>
+        </w:rPr>
+        <w:t>lift</w:t>
+      </w:r>
+      <w:proofErr w:type="spellEnd"/>
+      <w:r>
+        <w:rPr>
+          <w:lang w:val="es-AR"/>
+        </w:rPr>
+        <w:t xml:space="preserve"> de producto complementario, tasa de </w:t>
+      </w:r>
+      <w:proofErr w:type="spellStart"/>
+      <w:r>
+        <w:rPr>
+          <w:lang w:val="es-AR"/>
+        </w:rPr>
+        <w:t>cross-sell</w:t>
+      </w:r>
+      <w:proofErr w:type="spellEnd"/>
+      <w:r>
+        <w:rPr>
+          <w:lang w:val="es-AR"/>
+        </w:rPr>
+        <w:t xml:space="preserve"> por categoría, </w:t>
+      </w:r>
+      <w:proofErr w:type="gramStart"/>
+      <w:r>
+        <w:rPr>
+          <w:lang w:val="es-AR"/>
+        </w:rPr>
+        <w:t>ticket</w:t>
+      </w:r>
+      <w:proofErr w:type="gramEnd"/>
+      <w:r>
+        <w:rPr>
+          <w:lang w:val="es-AR"/>
+        </w:rPr>
+        <w:t xml:space="preserve"> incremental por </w:t>
+      </w:r>
+      <w:proofErr w:type="spellStart"/>
+      <w:r>
+        <w:rPr>
+          <w:lang w:val="es-AR"/>
+        </w:rPr>
+        <w:t>bundle</w:t>
+      </w:r>
+      <w:proofErr w:type="spellEnd"/>
+      <w:r>
+        <w:rPr>
+          <w:lang w:val="es-AR"/>
+        </w:rPr>
+        <w:t>, productos ancla vs productos satélite.</w:t>
+      </w:r>
+    </w:p>
+    <w:p>
+      <w:pPr>
+        <w:rPr>
+          <w:lang w:val="es-AR"/>
+        </w:rPr>
+      </w:pPr>
+      <w:r>
+        <w:rPr>
+          <w:lang w:val="es-AR"/>
+        </w:rPr>
+        <w:t>Módulo 4 · Segmentación de Clientes &amp; Valor de Vida</w:t>
+      </w:r>
+    </w:p>
+    <w:p>
+      <w:pPr>
+        <w:rPr>
+          <w:lang w:val="es-AR"/>
+        </w:rPr>
+      </w:pPr>
+      <w:proofErr w:type="spellStart"/>
+      <w:r>
+        <w:rPr>
+          <w:lang w:val="es-AR"/>
+        </w:rPr>
+        <w:t>RFM</w:t>
+      </w:r>
+      <w:proofErr w:type="spellEnd"/>
+      <w:r>
+        <w:rPr>
+          <w:lang w:val="es-AR"/>
+        </w:rPr>
+        <w:t xml:space="preserve"> (Recencia, Frecuencia, Monto) calculado en DAX. Segmentación en campeones, leales, en riesgo y perdidos. CLV estimado por segmento. Análisis de comportamiento por canal preferido. </w:t>
+      </w:r>
+      <w:proofErr w:type="spellStart"/>
+      <w:r>
+        <w:rPr>
+          <w:lang w:val="es-AR"/>
+        </w:rPr>
+        <w:t>KPIs</w:t>
+      </w:r>
+      <w:proofErr w:type="spellEnd"/>
+      <w:r>
+        <w:rPr>
+          <w:lang w:val="es-AR"/>
+        </w:rPr>
+        <w:t xml:space="preserve">: CLV, tasa de recompra, tiempo entre compras, </w:t>
+      </w:r>
+      <w:proofErr w:type="spellStart"/>
+      <w:r>
+        <w:rPr>
+          <w:lang w:val="es-AR"/>
+        </w:rPr>
+        <w:t>revenue</w:t>
+      </w:r>
+      <w:proofErr w:type="spellEnd"/>
+      <w:r>
+        <w:rPr>
+          <w:lang w:val="es-AR"/>
+        </w:rPr>
+        <w:t xml:space="preserve"> por segmento, </w:t>
+      </w:r>
+      <w:proofErr w:type="spellStart"/>
+      <w:r>
+        <w:rPr>
+          <w:lang w:val="es-AR"/>
+        </w:rPr>
+        <w:t>churn</w:t>
+      </w:r>
+      <w:proofErr w:type="spellEnd"/>
+      <w:r>
+        <w:rPr>
+          <w:lang w:val="es-AR"/>
+        </w:rPr>
+        <w:t xml:space="preserve"> estimado.</w:t>
+      </w:r>
+    </w:p>
+    <w:p>
+      <w:r>
+        <w:t xml:space="preserve">Stack </w:t>
+      </w:r>
+      <w:proofErr w:type="spellStart"/>
+      <w:r>
+        <w:t>técnico</w:t>
+      </w:r>
+      <w:proofErr w:type="spellEnd"/>
+      <w:r>
+        <w:t xml:space="preserve"> </w:t>
+      </w:r>
+      <w:proofErr w:type="spellStart"/>
+      <w:r>
+        <w:t>completo</w:t>
+      </w:r>
+      <w:proofErr w:type="spellEnd"/>
+    </w:p>
+    <w:tbl>
+      <w:tblPr>
+        <w:tblW w:w="10178" w:type="dxa"/>
+        <w:tblCellMar>
+          <w:left w:w="0" w:type="dxa"/>
+          <w:right w:w="0" w:type="dxa"/>
+        </w:tblCellMar>
+        <w:tblLook w:val="04A0" w:firstRow="1" w:lastRow="0" w:firstColumn="1" w:lastColumn="0" w:noHBand="0" w:noVBand="1"/>
+      </w:tblPr>
+      <w:tblGrid>
+        <w:gridCol w:w="3460"/>
+        <w:gridCol w:w="6718"/>
+      </w:tblGrid>
+      <w:tr>
+        <w:tc>
+          <w:tcPr>
+            <w:tcW w:w="3460" w:type="dxa"/>
+            <w:tcMar>
+              <w:top w:w="90" w:type="dxa"/>
+              <w:left w:w="90" w:type="dxa"/>
+              <w:bottom w:w="90" w:type="dxa"/>
+              <w:right w:w="90" w:type="dxa"/>
+            </w:tcMar>
+            <w:hideMark/>
+          </w:tcPr>
+          <w:p>
+            <w:proofErr w:type="spellStart"/>
+            <w:r>
+              <w:t>Modelado</w:t>
+            </w:r>
+            <w:proofErr w:type="spellEnd"/>
+            <w:r>
+              <w:t xml:space="preserve"> de </w:t>
+            </w:r>
+            <w:proofErr w:type="spellStart"/>
+            <w:r>
+              <w:t>datos</w:t>
+            </w:r>
+            <w:proofErr w:type="spellEnd"/>
+          </w:p>
+        </w:tc>
+        <w:tc>
+          <w:tcPr>
+            <w:tcW w:w="0" w:type="auto"/>
+            <w:tcMar>
+              <w:top w:w="90" w:type="dxa"/>
+              <w:left w:w="90" w:type="dxa"/>
+              <w:bottom w:w="90" w:type="dxa"/>
+              <w:right w:w="90" w:type="dxa"/>
+            </w:tcMar>
+            <w:hideMark/>
+          </w:tcPr>
+          <w:p>
+            <w:r>
+              <w:rPr>
+                <w:lang w:val="es-AR"/>
+              </w:rPr>
+              <w:t>Esquema estrella con 2 tablas de hechos (</w:t>
+            </w:r>
+            <w:proofErr w:type="spellStart"/>
+            <w:r>
+              <w:rPr>
+                <w:lang w:val="es-AR"/>
+              </w:rPr>
+              <w:t>FactVentas</w:t>
+            </w:r>
+            <w:proofErr w:type="spellEnd"/>
+            <w:r>
+              <w:rPr>
+                <w:lang w:val="es-AR"/>
+              </w:rPr>
+              <w:t xml:space="preserve"> + </w:t>
+            </w:r>
+            <w:proofErr w:type="spellStart"/>
+            <w:r>
+              <w:rPr>
+                <w:lang w:val="es-AR"/>
+              </w:rPr>
+              <w:t>FactPreciosCompetencia</w:t>
+            </w:r>
+            <w:proofErr w:type="spellEnd"/>
+            <w:r>
+              <w:rPr>
+                <w:lang w:val="es-AR"/>
+              </w:rPr>
+              <w:t xml:space="preserve">) y 7 dimensiones. </w:t>
+            </w:r>
+            <w:proofErr w:type="spellStart"/>
+            <w:r>
+              <w:t>Relaciones</w:t>
+            </w:r>
+            <w:proofErr w:type="spellEnd"/>
+            <w:r>
+              <w:t xml:space="preserve"> </w:t>
+            </w:r>
+            <w:proofErr w:type="spellStart"/>
+            <w:r>
+              <w:t>activas</w:t>
+            </w:r>
+            <w:proofErr w:type="spellEnd"/>
+            <w:r>
+              <w:t xml:space="preserve"> e </w:t>
+            </w:r>
+            <w:proofErr w:type="spellStart"/>
+            <w:r>
+              <w:t>inactivas</w:t>
+            </w:r>
+            <w:proofErr w:type="spellEnd"/>
+            <w:r>
+              <w:t xml:space="preserve"> con </w:t>
+            </w:r>
+            <w:proofErr w:type="spellStart"/>
+            <w:r>
+              <w:t>USERELATIONSHIP</w:t>
+            </w:r>
+            <w:proofErr w:type="spellEnd"/>
+            <w:r>
+              <w:t>.</w:t>
+            </w:r>
+          </w:p>
+        </w:tc>
+      </w:tr>
+      <w:tr>
+        <w:tc>
+          <w:tcPr>
+            <w:tcW w:w="3460" w:type="dxa"/>
+            <w:tcMar>
+              <w:top w:w="90" w:type="dxa"/>
+              <w:left w:w="90" w:type="dxa"/>
+              <w:bottom w:w="90" w:type="dxa"/>
+              <w:right w:w="90" w:type="dxa"/>
+            </w:tcMar>
+            <w:hideMark/>
+          </w:tcPr>
+          <w:p>
+            <w:r>
+              <w:t xml:space="preserve">DAX </w:t>
+            </w:r>
+            <w:proofErr w:type="spellStart"/>
+            <w:r>
+              <w:t>avanzado</w:t>
+            </w:r>
+            <w:proofErr w:type="spellEnd"/>
+          </w:p>
+        </w:tc>
+        <w:tc>
+          <w:tcPr>
+            <w:tcW w:w="0" w:type="auto"/>
+            <w:tcMar>
+              <w:top w:w="90" w:type="dxa"/>
+              <w:left w:w="90" w:type="dxa"/>
+              <w:bottom w:w="90" w:type="dxa"/>
+              <w:right w:w="90" w:type="dxa"/>
+            </w:tcMar>
+            <w:hideMark/>
+          </w:tcPr>
+          <w:p>
+            <w:r>
+              <w:t xml:space="preserve">CALCULATE · FILTER · ALL / </w:t>
+            </w:r>
+            <w:proofErr w:type="spellStart"/>
+            <w:r>
+              <w:t>ALLEXCEPT</w:t>
+            </w:r>
+            <w:proofErr w:type="spellEnd"/>
+            <w:r>
+              <w:t xml:space="preserve"> · </w:t>
+            </w:r>
+            <w:proofErr w:type="spellStart"/>
+            <w:r>
+              <w:t>USERELATIONSHIP</w:t>
+            </w:r>
+            <w:proofErr w:type="spellEnd"/>
+            <w:r>
+              <w:t xml:space="preserve"> · </w:t>
+            </w:r>
+            <w:proofErr w:type="spellStart"/>
+            <w:r>
+              <w:t>inteligencia</w:t>
+            </w:r>
+            <w:proofErr w:type="spellEnd"/>
+            <w:r>
+              <w:t xml:space="preserve"> de </w:t>
+            </w:r>
+            <w:proofErr w:type="spellStart"/>
+            <w:r>
+              <w:t>tiempo</w:t>
+            </w:r>
+            <w:proofErr w:type="spellEnd"/>
+            <w:r>
+              <w:t xml:space="preserve"> (YTD, </w:t>
+            </w:r>
+            <w:proofErr w:type="spellStart"/>
+            <w:r>
+              <w:t>MTD</w:t>
+            </w:r>
+            <w:proofErr w:type="spellEnd"/>
+            <w:r>
+              <w:t xml:space="preserve">, LY, MAT) · </w:t>
+            </w:r>
+            <w:proofErr w:type="spellStart"/>
+            <w:r>
+              <w:t>medidas</w:t>
+            </w:r>
+            <w:proofErr w:type="spellEnd"/>
+            <w:r>
+              <w:t xml:space="preserve"> semi-</w:t>
+            </w:r>
+            <w:proofErr w:type="spellStart"/>
+            <w:r>
+              <w:t>aditivas</w:t>
+            </w:r>
+            <w:proofErr w:type="spellEnd"/>
+            <w:r>
+              <w:t xml:space="preserve"> · </w:t>
+            </w:r>
+            <w:proofErr w:type="spellStart"/>
+            <w:r>
+              <w:t>parámetros</w:t>
+            </w:r>
+            <w:proofErr w:type="spellEnd"/>
+            <w:r>
+              <w:t xml:space="preserve"> What-If · variables (VAR/RETURN) · </w:t>
+            </w:r>
+            <w:proofErr w:type="spellStart"/>
+            <w:r>
+              <w:t>RANKX</w:t>
+            </w:r>
+            <w:proofErr w:type="spellEnd"/>
+            <w:r>
+              <w:t xml:space="preserve"> · </w:t>
+            </w:r>
+            <w:proofErr w:type="spellStart"/>
+            <w:r>
+              <w:t>TOPN</w:t>
+            </w:r>
+            <w:proofErr w:type="spellEnd"/>
+            <w:r>
+              <w:t xml:space="preserve"> · </w:t>
+            </w:r>
+            <w:proofErr w:type="spellStart"/>
+            <w:r>
+              <w:t>CROSSFILTER</w:t>
+            </w:r>
+            <w:proofErr w:type="spellEnd"/>
+          </w:p>
+        </w:tc>
+      </w:tr>
+      <w:tr>
+        <w:tc>
+          <w:tcPr>
+            <w:tcW w:w="3460" w:type="dxa"/>
+            <w:tcMar>
+              <w:top w:w="90" w:type="dxa"/>
+              <w:left w:w="90" w:type="dxa"/>
+              <w:bottom w:w="90" w:type="dxa"/>
+              <w:right w:w="90" w:type="dxa"/>
+            </w:tcMar>
+            <w:hideMark/>
+          </w:tcPr>
+          <w:p>
+            <w:r>
+              <w:t>Power Query (M)</w:t>
+            </w:r>
+          </w:p>
+        </w:tc>
+        <w:tc>
+          <w:tcPr>
+            <w:tcW w:w="0" w:type="auto"/>
+            <w:tcMar>
+              <w:top w:w="90" w:type="dxa"/>
+              <w:left w:w="90" w:type="dxa"/>
+              <w:bottom w:w="90" w:type="dxa"/>
+              <w:right w:w="90" w:type="dxa"/>
+            </w:tcMar>
+            <w:hideMark/>
+          </w:tcPr>
+          <w:p>
+            <w:r>
+              <w:rPr>
+                <w:lang w:val="es-AR"/>
+              </w:rPr>
+              <w:t xml:space="preserve">ETL </w:t>
+            </w:r>
+            <w:proofErr w:type="spellStart"/>
+            <w:r>
+              <w:rPr>
+                <w:lang w:val="es-AR"/>
+              </w:rPr>
+              <w:t>multi-fuente</w:t>
+            </w:r>
+            <w:proofErr w:type="spellEnd"/>
+            <w:r>
+              <w:rPr>
+                <w:lang w:val="es-AR"/>
+              </w:rPr>
+              <w:t xml:space="preserve">: </w:t>
+            </w:r>
+            <w:proofErr w:type="spellStart"/>
+            <w:r>
+              <w:rPr>
+                <w:lang w:val="es-AR"/>
+              </w:rPr>
+              <w:t>merge</w:t>
+            </w:r>
+            <w:proofErr w:type="spellEnd"/>
+            <w:r>
+              <w:rPr>
+                <w:lang w:val="es-AR"/>
+              </w:rPr>
+              <w:t xml:space="preserve"> de tablas </w:t>
+            </w:r>
+            <w:proofErr w:type="spellStart"/>
+            <w:r>
+              <w:rPr>
+                <w:lang w:val="es-AR"/>
+              </w:rPr>
+              <w:t>Kaggle</w:t>
+            </w:r>
+            <w:proofErr w:type="spellEnd"/>
+            <w:r>
+              <w:rPr>
+                <w:lang w:val="es-AR"/>
+              </w:rPr>
+              <w:t xml:space="preserve"> + capa sintética AR + archivo IPC </w:t>
+            </w:r>
+            <w:proofErr w:type="spellStart"/>
+            <w:r>
+              <w:rPr>
+                <w:lang w:val="es-AR"/>
+              </w:rPr>
+              <w:t>INDEC</w:t>
+            </w:r>
+            <w:proofErr w:type="spellEnd"/>
+            <w:r>
+              <w:rPr>
+                <w:lang w:val="es-AR"/>
+              </w:rPr>
+              <w:t xml:space="preserve"> (opcional). </w:t>
+            </w:r>
+            <w:proofErr w:type="spellStart"/>
+            <w:r>
+              <w:t>Transformaciones</w:t>
+            </w:r>
+            <w:proofErr w:type="spellEnd"/>
+            <w:r>
+              <w:t xml:space="preserve"> de </w:t>
+            </w:r>
+            <w:proofErr w:type="spellStart"/>
+            <w:r>
+              <w:t>tipo</w:t>
+            </w:r>
+            <w:proofErr w:type="spellEnd"/>
+            <w:r>
+              <w:t xml:space="preserve">, </w:t>
+            </w:r>
+            <w:proofErr w:type="spellStart"/>
+            <w:r>
+              <w:t>normalización</w:t>
+            </w:r>
+            <w:proofErr w:type="spellEnd"/>
+            <w:r>
+              <w:t xml:space="preserve"> de SKUs, columnas </w:t>
+            </w:r>
+            <w:proofErr w:type="spellStart"/>
+            <w:r>
+              <w:t>condicionales</w:t>
+            </w:r>
+            <w:proofErr w:type="spellEnd"/>
+            <w:r>
+              <w:t>.</w:t>
+            </w:r>
+          </w:p>
+        </w:tc>
+      </w:tr>
+      <w:tr>
+        <w:tc>
+          <w:tcPr>
+            <w:tcW w:w="3460" w:type="dxa"/>
+            <w:tcMar>
+              <w:top w:w="90" w:type="dxa"/>
+              <w:left w:w="90" w:type="dxa"/>
+              <w:bottom w:w="90" w:type="dxa"/>
+              <w:right w:w="90" w:type="dxa"/>
+            </w:tcMar>
+            <w:hideMark/>
+          </w:tcPr>
+          <w:p>
+            <w:r>
+              <w:t>Python (pre-</w:t>
+            </w:r>
+            <w:proofErr w:type="spellStart"/>
+            <w:r>
+              <w:t>proceso</w:t>
+            </w:r>
+            <w:proofErr w:type="spellEnd"/>
+            <w:r>
+              <w:t>)</w:t>
+            </w:r>
+          </w:p>
+        </w:tc>
+        <w:tc>
+          <w:tcPr>
+            <w:tcW w:w="0" w:type="auto"/>
+            <w:tcMar>
+              <w:top w:w="90" w:type="dxa"/>
+              <w:left w:w="90" w:type="dxa"/>
+              <w:bottom w:w="90" w:type="dxa"/>
+              <w:right w:w="90" w:type="dxa"/>
+            </w:tcMar>
+            <w:hideMark/>
+          </w:tcPr>
+          <w:p>
+            <w:pPr>
+              <w:rPr>
+                <w:lang w:val="es-AR"/>
+              </w:rPr>
+            </w:pPr>
+            <w:r>
+              <w:rPr>
+                <w:lang w:val="es-AR"/>
+              </w:rPr>
+              <w:t xml:space="preserve">Limpieza y unión de </w:t>
+            </w:r>
+            <w:proofErr w:type="spellStart"/>
+            <w:r>
+              <w:rPr>
+                <w:lang w:val="es-AR"/>
+              </w:rPr>
+              <w:t>datasets</w:t>
+            </w:r>
+            <w:proofErr w:type="spellEnd"/>
+            <w:r>
+              <w:rPr>
+                <w:lang w:val="es-AR"/>
+              </w:rPr>
+              <w:t xml:space="preserve"> · generación de capa AR sintética (Faker) · cálculo de reglas de asociación (</w:t>
+            </w:r>
+            <w:proofErr w:type="spellStart"/>
+            <w:r>
+              <w:rPr>
+                <w:lang w:val="es-AR"/>
+              </w:rPr>
+              <w:t>mlxtend</w:t>
+            </w:r>
+            <w:proofErr w:type="spellEnd"/>
+            <w:r>
+              <w:rPr>
+                <w:lang w:val="es-AR"/>
+              </w:rPr>
+              <w:t xml:space="preserve">: </w:t>
+            </w:r>
+            <w:proofErr w:type="spellStart"/>
+            <w:r>
+              <w:rPr>
+                <w:lang w:val="es-AR"/>
+              </w:rPr>
+              <w:t>apriori</w:t>
+            </w:r>
+            <w:proofErr w:type="spellEnd"/>
+            <w:r>
+              <w:rPr>
+                <w:lang w:val="es-AR"/>
+              </w:rPr>
+              <w:t xml:space="preserve"> + </w:t>
+            </w:r>
+            <w:proofErr w:type="spellStart"/>
+            <w:r>
+              <w:rPr>
+                <w:lang w:val="es-AR"/>
+              </w:rPr>
+              <w:t>association_rules</w:t>
+            </w:r>
+            <w:proofErr w:type="spellEnd"/>
+            <w:r>
+              <w:rPr>
+                <w:lang w:val="es-AR"/>
+              </w:rPr>
+              <w:t>) · exportación a CSV para Power BI.</w:t>
+            </w:r>
+          </w:p>
+        </w:tc>
+      </w:tr>
+      <w:tr>
+        <w:tc>
+          <w:tcPr>
+            <w:tcW w:w="3460" w:type="dxa"/>
+            <w:tcMar>
+              <w:top w:w="90" w:type="dxa"/>
+              <w:left w:w="90" w:type="dxa"/>
+              <w:bottom w:w="90" w:type="dxa"/>
+              <w:right w:w="90" w:type="dxa"/>
+            </w:tcMar>
+            <w:hideMark/>
+          </w:tcPr>
+          <w:p>
+            <w:proofErr w:type="spellStart"/>
+            <w:r>
+              <w:lastRenderedPageBreak/>
+              <w:t>Contexto</w:t>
+            </w:r>
+            <w:proofErr w:type="spellEnd"/>
+            <w:r>
+              <w:t xml:space="preserve"> </w:t>
+            </w:r>
+            <w:proofErr w:type="spellStart"/>
+            <w:r>
+              <w:t>inflacionario</w:t>
+            </w:r>
+            <w:proofErr w:type="spellEnd"/>
+          </w:p>
+        </w:tc>
+        <w:tc>
+          <w:tcPr>
+            <w:tcW w:w="0" w:type="auto"/>
+            <w:tcMar>
+              <w:top w:w="90" w:type="dxa"/>
+              <w:left w:w="90" w:type="dxa"/>
+              <w:bottom w:w="90" w:type="dxa"/>
+              <w:right w:w="90" w:type="dxa"/>
+            </w:tcMar>
+            <w:hideMark/>
+          </w:tcPr>
+          <w:p>
+            <w:pPr>
+              <w:rPr>
+                <w:lang w:val="es-AR"/>
+              </w:rPr>
+            </w:pPr>
+            <w:r>
+              <w:rPr>
+                <w:lang w:val="es-AR"/>
+              </w:rPr>
+              <w:t xml:space="preserve">Capa opcional: tabla </w:t>
+            </w:r>
+            <w:proofErr w:type="spellStart"/>
+            <w:r>
+              <w:rPr>
+                <w:lang w:val="es-AR"/>
+              </w:rPr>
+              <w:t>DimInflación</w:t>
+            </w:r>
+            <w:proofErr w:type="spellEnd"/>
+            <w:r>
+              <w:rPr>
+                <w:lang w:val="es-AR"/>
+              </w:rPr>
+              <w:t xml:space="preserve"> con IPC mensual del </w:t>
+            </w:r>
+            <w:proofErr w:type="spellStart"/>
+            <w:r>
+              <w:rPr>
+                <w:lang w:val="es-AR"/>
+              </w:rPr>
+              <w:t>INDEC</w:t>
+            </w:r>
+            <w:proofErr w:type="spellEnd"/>
+            <w:r>
+              <w:rPr>
+                <w:lang w:val="es-AR"/>
+              </w:rPr>
+              <w:t>. Medidas DAX de precio real vs nominal, ajuste por período base.</w:t>
+            </w:r>
+          </w:p>
+        </w:tc>
+      </w:tr>
+      <w:tr>
+        <w:tc>
+          <w:tcPr>
+            <w:tcW w:w="3460" w:type="dxa"/>
+            <w:tcMar>
+              <w:top w:w="90" w:type="dxa"/>
+              <w:left w:w="90" w:type="dxa"/>
+              <w:bottom w:w="90" w:type="dxa"/>
+              <w:right w:w="90" w:type="dxa"/>
+            </w:tcMar>
+            <w:hideMark/>
+          </w:tcPr>
+          <w:p>
+            <w:proofErr w:type="spellStart"/>
+            <w:r>
+              <w:t>Visualizaciones</w:t>
+            </w:r>
+            <w:proofErr w:type="spellEnd"/>
+          </w:p>
+        </w:tc>
+        <w:tc>
+          <w:tcPr>
+            <w:tcW w:w="0" w:type="auto"/>
+            <w:tcMar>
+              <w:top w:w="90" w:type="dxa"/>
+              <w:left w:w="90" w:type="dxa"/>
+              <w:bottom w:w="90" w:type="dxa"/>
+              <w:right w:w="90" w:type="dxa"/>
+            </w:tcMar>
+            <w:hideMark/>
+          </w:tcPr>
+          <w:p>
+            <w:pPr>
+              <w:rPr>
+                <w:lang w:val="es-AR"/>
+              </w:rPr>
+            </w:pPr>
+            <w:r>
+              <w:rPr>
+                <w:lang w:val="es-AR"/>
+              </w:rPr>
+              <w:t xml:space="preserve">Matrix con formato condicional · </w:t>
+            </w:r>
+            <w:proofErr w:type="spellStart"/>
+            <w:r>
+              <w:rPr>
+                <w:lang w:val="es-AR"/>
+              </w:rPr>
+              <w:t>scatter</w:t>
+            </w:r>
+            <w:proofErr w:type="spellEnd"/>
+            <w:r>
+              <w:rPr>
+                <w:lang w:val="es-AR"/>
+              </w:rPr>
+              <w:t xml:space="preserve"> </w:t>
+            </w:r>
+            <w:proofErr w:type="spellStart"/>
+            <w:r>
+              <w:rPr>
+                <w:lang w:val="es-AR"/>
+              </w:rPr>
+              <w:t>plot</w:t>
+            </w:r>
+            <w:proofErr w:type="spellEnd"/>
+            <w:r>
+              <w:rPr>
+                <w:lang w:val="es-AR"/>
+              </w:rPr>
+              <w:t xml:space="preserve"> precio vs margen · mapa de calor por provincia · </w:t>
+            </w:r>
+            <w:proofErr w:type="spellStart"/>
+            <w:r>
+              <w:rPr>
+                <w:lang w:val="es-AR"/>
+              </w:rPr>
+              <w:t>treemap</w:t>
+            </w:r>
+            <w:proofErr w:type="spellEnd"/>
+            <w:r>
+              <w:rPr>
+                <w:lang w:val="es-AR"/>
+              </w:rPr>
+              <w:t xml:space="preserve"> de categorías · </w:t>
+            </w:r>
+            <w:proofErr w:type="spellStart"/>
+            <w:r>
+              <w:rPr>
+                <w:lang w:val="es-AR"/>
+              </w:rPr>
+              <w:t>waterfall</w:t>
+            </w:r>
+            <w:proofErr w:type="spellEnd"/>
+            <w:r>
+              <w:rPr>
+                <w:lang w:val="es-AR"/>
+              </w:rPr>
+              <w:t xml:space="preserve"> de rentabilidad · gráfico de burbujas CLV vs frecuencia</w:t>
+            </w:r>
+          </w:p>
+        </w:tc>
+      </w:tr>
+    </w:tbl>
+    <w:p>
+      <w:pPr>
+        <w:rPr>
+          <w:lang w:val="es-AR"/>
+        </w:rPr>
+      </w:pPr>
+    </w:p>
+    <w:p>
+      <w:pPr>
+        <w:rPr>
+          <w:lang w:val="es-AR"/>
+        </w:rPr>
+      </w:pPr>
+    </w:p>
+    <w:p>
+      <w:pPr>
+        <w:rPr>
+          <w:lang w:val="es-AR"/>
+        </w:rPr>
+      </w:pPr>
+      <w:r>
+        <w:rPr>
+          <w:lang w:val="es-AR"/>
+        </w:rPr>
         <w:t>Fase 1</w:t>
-      </w:r>
-    </w:p>
-    <w:p>
-      <w:pPr>
-        <w:rPr>
-          <w:lang w:val="es-AR"/>
-        </w:rPr>
-      </w:pPr>
-      <w:r>
-        <w:rPr>
-          <w:lang w:val="es-AR"/>
-        </w:rPr>
-        <w:t>Semanas 1 – 2</w:t>
       </w:r>
     </w:p>
     <w:p>
@@ -263,19 +1970,6 @@
         <w:rPr>
           <w:lang w:val="es-AR"/>
         </w:rPr>
-        <w:t>Semanas 3 – 4</w:t>
-      </w:r>
-    </w:p>
-    <w:p>
-      <w:pPr>
-        <w:rPr>
-          <w:lang w:val="es-AR"/>
-        </w:rPr>
-      </w:pPr>
-      <w:r>
-        <w:rPr>
-          <w:lang w:val="es-AR"/>
-        </w:rPr>
         <w:t>Medidas DAX base y módulo de ventas</w:t>
       </w:r>
     </w:p>
@@ -455,15 +2149,7 @@
       </w:r>
       <w:proofErr w:type="spellEnd"/>
       <w:r>
-        <w:t xml:space="preserve"> </w:t>
-      </w:r>
-      <w:proofErr w:type="spellStart"/>
-      <w:r>
-        <w:t>en</w:t>
-      </w:r>
-      <w:proofErr w:type="spellEnd"/>
-      <w:r>
-        <w:t xml:space="preserve"> matrices, </w:t>
+        <w:t xml:space="preserve"> en matrices, </w:t>
       </w:r>
       <w:proofErr w:type="spellStart"/>
       <w:r>
@@ -526,19 +2212,6 @@
           <w:lang w:val="es-AR"/>
         </w:rPr>
         <w:t>Fase 3</w:t>
-      </w:r>
-    </w:p>
-    <w:p>
-      <w:pPr>
-        <w:rPr>
-          <w:lang w:val="es-AR"/>
-        </w:rPr>
-      </w:pPr>
-      <w:r>
-        <w:rPr>
-          <w:lang w:val="es-AR"/>
-        </w:rPr>
-        <w:t>Semanas 5 – 6</w:t>
       </w:r>
     </w:p>
     <w:p>
@@ -577,6 +2250,7 @@
       </w:pPr>
       <w:proofErr w:type="spellStart"/>
       <w:r>
+        <w:lastRenderedPageBreak/>
         <w:t>Activar</w:t>
       </w:r>
       <w:proofErr w:type="spellEnd"/>
@@ -739,7 +2413,6 @@
         <w:rPr>
           <w:lang w:val="es-AR"/>
         </w:rPr>
-        <w:lastRenderedPageBreak/>
         <w:t>Dashboard</w:t>
       </w:r>
       <w:proofErr w:type="spellEnd"/>
@@ -774,19 +2447,6 @@
           <w:lang w:val="es-AR"/>
         </w:rPr>
         <w:t>Fase 4</w:t>
-      </w:r>
-    </w:p>
-    <w:p>
-      <w:pPr>
-        <w:rPr>
-          <w:lang w:val="es-AR"/>
-        </w:rPr>
-      </w:pPr>
-      <w:r>
-        <w:rPr>
-          <w:lang w:val="es-AR"/>
-        </w:rPr>
-        <w:t>Semanas 7 – 8</w:t>
       </w:r>
     </w:p>
     <w:p>
@@ -1024,19 +2684,6 @@
         <w:rPr>
           <w:lang w:val="es-AR"/>
         </w:rPr>
-        <w:t>Semana 9</w:t>
-      </w:r>
-    </w:p>
-    <w:p>
-      <w:pPr>
-        <w:rPr>
-          <w:lang w:val="es-AR"/>
-        </w:rPr>
-      </w:pPr>
-      <w:r>
-        <w:rPr>
-          <w:lang w:val="es-AR"/>
-        </w:rPr>
         <w:t>Pulido, narrativa de negocio y presentación</w:t>
       </w:r>
     </w:p>
@@ -1276,6 +2923,669 @@
         </w:rPr>
         <w:t>Entregable: proyecto completo publicado en GitHub + Power BI Service</w:t>
       </w:r>
+    </w:p>
+    <w:p>
+      <w:pPr>
+        <w:rPr>
+          <w:lang w:val="es-AR"/>
+        </w:rPr>
+      </w:pPr>
+      <w:r>
+        <w:rPr>
+          <w:lang w:val="es-AR"/>
+        </w:rPr>
+        <w:br w:type="page"/>
+      </w:r>
+    </w:p>
+    <w:p>
+      <w:pPr>
+        <w:rPr>
+          <w:b/>
+          <w:bCs/>
+          <w:lang w:val="es-AR"/>
+        </w:rPr>
+      </w:pPr>
+      <w:r>
+        <w:rPr>
+          <w:b/>
+          <w:bCs/>
+          <w:lang w:val="es-AR"/>
+        </w:rPr>
+        <w:lastRenderedPageBreak/>
+        <w:t xml:space="preserve">2. </w:t>
+      </w:r>
+      <w:proofErr w:type="spellStart"/>
+      <w:r>
+        <w:rPr>
+          <w:b/>
+          <w:bCs/>
+          <w:lang w:val="es-AR"/>
+        </w:rPr>
+        <w:t>Roadmap</w:t>
+      </w:r>
+      <w:proofErr w:type="spellEnd"/>
+      <w:r>
+        <w:rPr>
+          <w:b/>
+          <w:bCs/>
+          <w:lang w:val="es-AR"/>
+        </w:rPr>
+        <w:t xml:space="preserve"> de implementación</w:t>
+      </w:r>
+    </w:p>
+    <w:p>
+      <w:pPr>
+        <w:rPr>
+          <w:lang w:val="es-AR"/>
+        </w:rPr>
+      </w:pPr>
+      <w:r>
+        <w:rPr>
+          <w:lang w:val="es-AR"/>
+        </w:rPr>
+        <w:t>El proyecto tiene 5 fases pensadas para 8 a 10 semanas de trabajo real. Cada fase produce un entregable concreto.</w:t>
+      </w:r>
+    </w:p>
+    <w:p>
+      <w:pPr>
+        <w:rPr>
+          <w:lang w:val="es-AR"/>
+        </w:rPr>
+      </w:pPr>
+      <w:r>
+        <w:rPr>
+          <w:lang w:val="es-AR"/>
+        </w:rPr>
+        <w:t>V</w:t>
+      </w:r>
+    </w:p>
+    <w:p>
+      <w:pPr>
+        <w:rPr>
+          <w:lang w:val="es-AR"/>
+        </w:rPr>
+      </w:pPr>
+      <w:proofErr w:type="spellStart"/>
+      <w:r>
+        <w:rPr>
+          <w:lang w:val="es-AR"/>
+        </w:rPr>
+        <w:t>visualize</w:t>
+      </w:r>
+      <w:proofErr w:type="spellEnd"/>
+    </w:p>
+    <w:p>
+      <w:pPr>
+        <w:rPr>
+          <w:lang w:val="es-AR"/>
+        </w:rPr>
+      </w:pPr>
+      <w:r>
+        <w:t></w:t>
+      </w:r>
+    </w:p>
+    <w:p>
+      <w:pPr>
+        <w:rPr>
+          <w:lang w:val="es-AR"/>
+        </w:rPr>
+      </w:pPr>
+      <w:r>
+        <w:rPr>
+          <w:lang w:val="es-AR"/>
+        </w:rPr>
+        <w:t>V</w:t>
+      </w:r>
+    </w:p>
+    <w:p>
+      <w:pPr>
+        <w:rPr>
+          <w:lang w:val="es-AR"/>
+        </w:rPr>
+      </w:pPr>
+      <w:proofErr w:type="spellStart"/>
+      <w:r>
+        <w:rPr>
+          <w:lang w:val="es-AR"/>
+        </w:rPr>
+        <w:t>visualize</w:t>
+      </w:r>
+      <w:proofErr w:type="spellEnd"/>
+      <w:r>
+        <w:rPr>
+          <w:lang w:val="es-AR"/>
+        </w:rPr>
+        <w:t xml:space="preserve"> </w:t>
+      </w:r>
+      <w:proofErr w:type="spellStart"/>
+      <w:proofErr w:type="gramStart"/>
+      <w:r>
+        <w:rPr>
+          <w:lang w:val="es-AR"/>
+        </w:rPr>
+        <w:t>show</w:t>
+      </w:r>
+      <w:proofErr w:type="gramEnd"/>
+      <w:r>
+        <w:rPr>
+          <w:lang w:val="es-AR"/>
+        </w:rPr>
+        <w:t>_widget</w:t>
+      </w:r>
+      <w:proofErr w:type="spellEnd"/>
+    </w:p>
+    <w:p>
+      <w:r>
+        <w:t></w:t>
+      </w:r>
+    </w:p>
+    <w:p>
+      <w:r>
+        <w:pict w14:anchorId="24867854">
+          <v:rect id="_x0000_i1037" style="width:0;height:1.5pt" o:hralign="center" o:hrstd="t" o:hr="t" fillcolor="#a0a0a0" stroked="f"/>
+        </w:pict>
+      </w:r>
+    </w:p>
+    <w:p>
+      <w:pPr>
+        <w:rPr>
+          <w:b/>
+          <w:bCs/>
+          <w:lang w:val="es-AR"/>
+        </w:rPr>
+      </w:pPr>
+      <w:r>
+        <w:rPr>
+          <w:b/>
+          <w:bCs/>
+          <w:lang w:val="es-AR"/>
+        </w:rPr>
+        <w:t xml:space="preserve">3. </w:t>
+      </w:r>
+      <w:proofErr w:type="spellStart"/>
+      <w:r>
+        <w:rPr>
+          <w:b/>
+          <w:bCs/>
+          <w:lang w:val="es-AR"/>
+        </w:rPr>
+        <w:t>KPIs</w:t>
+      </w:r>
+      <w:proofErr w:type="spellEnd"/>
+      <w:r>
+        <w:rPr>
+          <w:b/>
+          <w:bCs/>
+          <w:lang w:val="es-AR"/>
+        </w:rPr>
+        <w:t xml:space="preserve"> principales con fórmulas DAX</w:t>
+      </w:r>
+    </w:p>
+    <w:p>
+      <w:pPr>
+        <w:rPr>
+          <w:lang w:val="es-AR"/>
+        </w:rPr>
+      </w:pPr>
+      <w:r>
+        <w:rPr>
+          <w:lang w:val="es-AR"/>
+        </w:rPr>
+        <w:t>Acá están las medidas más importantes agrupadas por módulo, con el código DAX real y comentarios que explican la lógica. Estas son exactamente las fórmulas que te preguntarán en entrevistas técnicas.</w:t>
+      </w:r>
+    </w:p>
+    <w:p>
+      <w:r>
+        <w:t>V</w:t>
+      </w:r>
+    </w:p>
+    <w:p>
+      <w:r>
+        <w:t>visualize</w:t>
+      </w:r>
+    </w:p>
+    <w:p>
+      <w:r>
+        <w:t></w:t>
+      </w:r>
+    </w:p>
+    <w:p>
+      <w:r>
+        <w:t>V</w:t>
+      </w:r>
+    </w:p>
+    <w:p>
+      <w:r>
+        <w:t xml:space="preserve">visualize </w:t>
+      </w:r>
+      <w:proofErr w:type="spellStart"/>
+      <w:r>
+        <w:t>show_widget</w:t>
+      </w:r>
+      <w:proofErr w:type="spellEnd"/>
+    </w:p>
+    <w:p>
+      <w:r>
+        <w:t></w:t>
+      </w:r>
+    </w:p>
+    <w:p>
+      <w:r>
+        <w:pict w14:anchorId="55C2F0E7">
+          <v:rect id="_x0000_i1038" style="width:0;height:1.5pt" o:hralign="center" o:hrstd="t" o:hr="t" fillcolor="#a0a0a0" stroked="f"/>
+        </w:pict>
+      </w:r>
+    </w:p>
+    <w:p>
+      <w:pPr>
+        <w:rPr>
+          <w:lang w:val="es-AR"/>
+        </w:rPr>
+      </w:pPr>
+      <w:r>
+        <w:rPr>
+          <w:lang w:val="es-AR"/>
+        </w:rPr>
+        <w:t xml:space="preserve">Con esto </w:t>
+      </w:r>
+      <w:proofErr w:type="spellStart"/>
+      <w:r>
+        <w:rPr>
+          <w:lang w:val="es-AR"/>
+        </w:rPr>
+        <w:t>tenés</w:t>
+      </w:r>
+      <w:proofErr w:type="spellEnd"/>
+      <w:r>
+        <w:rPr>
+          <w:lang w:val="es-AR"/>
+        </w:rPr>
+        <w:t xml:space="preserve"> los tres pilares del proyecto completamente definidos. Un resumen de lo que </w:t>
+      </w:r>
+      <w:proofErr w:type="spellStart"/>
+      <w:r>
+        <w:rPr>
+          <w:lang w:val="es-AR"/>
+        </w:rPr>
+        <w:t>acabás</w:t>
+      </w:r>
+      <w:proofErr w:type="spellEnd"/>
+      <w:r>
+        <w:rPr>
+          <w:lang w:val="es-AR"/>
+        </w:rPr>
+        <w:t xml:space="preserve"> de recibir:</w:t>
+      </w:r>
+    </w:p>
+    <w:p>
+      <w:pPr>
+        <w:rPr>
+          <w:lang w:val="es-AR"/>
+        </w:rPr>
+      </w:pPr>
+      <w:r>
+        <w:rPr>
+          <w:lang w:val="es-AR"/>
+        </w:rPr>
+        <w:t xml:space="preserve">El </w:t>
+      </w:r>
+      <w:r>
+        <w:rPr>
+          <w:b/>
+          <w:bCs/>
+          <w:lang w:val="es-AR"/>
+        </w:rPr>
+        <w:t>modelo de datos</w:t>
+      </w:r>
+      <w:r>
+        <w:rPr>
+          <w:lang w:val="es-AR"/>
+        </w:rPr>
+        <w:t xml:space="preserve"> usa esquema galaxia con dos tablas de hechos conectadas por dimensiones compartidas — el </w:t>
+      </w:r>
+      <w:proofErr w:type="spellStart"/>
+      <w:r>
+        <w:rPr>
+          <w:lang w:val="es-AR"/>
+        </w:rPr>
+        <w:t>USERELATIONSHIP</w:t>
+      </w:r>
+      <w:proofErr w:type="spellEnd"/>
+      <w:r>
+        <w:rPr>
+          <w:lang w:val="es-AR"/>
+        </w:rPr>
+        <w:t xml:space="preserve"> entre </w:t>
+      </w:r>
+      <w:proofErr w:type="spellStart"/>
+      <w:r>
+        <w:rPr>
+          <w:lang w:val="es-AR"/>
+        </w:rPr>
+        <w:t>FactVentas</w:t>
+      </w:r>
+      <w:proofErr w:type="spellEnd"/>
+      <w:r>
+        <w:rPr>
+          <w:lang w:val="es-AR"/>
+        </w:rPr>
+        <w:t xml:space="preserve"> y </w:t>
+      </w:r>
+      <w:proofErr w:type="spellStart"/>
+      <w:r>
+        <w:rPr>
+          <w:lang w:val="es-AR"/>
+        </w:rPr>
+        <w:t>FactPreciosComp</w:t>
+      </w:r>
+      <w:proofErr w:type="spellEnd"/>
+      <w:r>
+        <w:rPr>
+          <w:lang w:val="es-AR"/>
+        </w:rPr>
+        <w:t xml:space="preserve"> es el punto técnico más diferenciador del proyecto frente a otros </w:t>
+      </w:r>
+      <w:proofErr w:type="gramStart"/>
+      <w:r>
+        <w:rPr>
+          <w:lang w:val="es-AR"/>
+        </w:rPr>
+        <w:t>portfolios</w:t>
+      </w:r>
+      <w:proofErr w:type="gramEnd"/>
+      <w:r>
+        <w:rPr>
+          <w:lang w:val="es-AR"/>
+        </w:rPr>
+        <w:t>.</w:t>
+      </w:r>
+    </w:p>
+    <w:p>
+      <w:pPr>
+        <w:rPr>
+          <w:lang w:val="es-AR"/>
+        </w:rPr>
+      </w:pPr>
+      <w:r>
+        <w:rPr>
+          <w:lang w:val="es-AR"/>
+        </w:rPr>
+        <w:lastRenderedPageBreak/>
+        <w:t xml:space="preserve">El </w:t>
+      </w:r>
+      <w:proofErr w:type="spellStart"/>
+      <w:r>
+        <w:rPr>
+          <w:b/>
+          <w:bCs/>
+          <w:lang w:val="es-AR"/>
+        </w:rPr>
+        <w:t>roadmap</w:t>
+      </w:r>
+      <w:proofErr w:type="spellEnd"/>
+      <w:r>
+        <w:rPr>
+          <w:lang w:val="es-AR"/>
+        </w:rPr>
+        <w:t xml:space="preserve"> está pensado para que cada fase produzca algo presentable: al final de la semana 4 ya </w:t>
+      </w:r>
+      <w:proofErr w:type="spellStart"/>
+      <w:r>
+        <w:rPr>
+          <w:lang w:val="es-AR"/>
+        </w:rPr>
+        <w:t>tenés</w:t>
+      </w:r>
+      <w:proofErr w:type="spellEnd"/>
+      <w:r>
+        <w:rPr>
+          <w:lang w:val="es-AR"/>
+        </w:rPr>
+        <w:t xml:space="preserve"> una página de </w:t>
+      </w:r>
+      <w:proofErr w:type="spellStart"/>
+      <w:r>
+        <w:rPr>
+          <w:lang w:val="es-AR"/>
+        </w:rPr>
+        <w:t>dashboard</w:t>
+      </w:r>
+      <w:proofErr w:type="spellEnd"/>
+      <w:r>
+        <w:rPr>
+          <w:lang w:val="es-AR"/>
+        </w:rPr>
+        <w:t xml:space="preserve"> completa y funcional, lo que te permite mostrar avances parciales si fuera necesario.</w:t>
+      </w:r>
+    </w:p>
+    <w:p>
+      <w:pPr>
+        <w:rPr>
+          <w:lang w:val="es-AR"/>
+        </w:rPr>
+      </w:pPr>
+      <w:r>
+        <w:rPr>
+          <w:lang w:val="es-AR"/>
+        </w:rPr>
+        <w:t xml:space="preserve">Las </w:t>
+      </w:r>
+      <w:r>
+        <w:rPr>
+          <w:b/>
+          <w:bCs/>
+          <w:lang w:val="es-AR"/>
+        </w:rPr>
+        <w:t>fórmulas DAX</w:t>
+      </w:r>
+      <w:r>
+        <w:rPr>
+          <w:lang w:val="es-AR"/>
+        </w:rPr>
+        <w:t xml:space="preserve"> incluyen los patrones que más aparecen en entrevistas: </w:t>
+      </w:r>
+      <w:proofErr w:type="spellStart"/>
+      <w:r>
+        <w:rPr>
+          <w:lang w:val="es-AR"/>
+        </w:rPr>
+        <w:t>CALCULATE</w:t>
+      </w:r>
+      <w:proofErr w:type="spellEnd"/>
+      <w:r>
+        <w:rPr>
+          <w:lang w:val="es-AR"/>
+        </w:rPr>
+        <w:t xml:space="preserve"> con ALL/</w:t>
+      </w:r>
+      <w:proofErr w:type="spellStart"/>
+      <w:r>
+        <w:rPr>
+          <w:lang w:val="es-AR"/>
+        </w:rPr>
+        <w:t>ALLEXCEPT</w:t>
+      </w:r>
+      <w:proofErr w:type="spellEnd"/>
+      <w:r>
+        <w:rPr>
+          <w:lang w:val="es-AR"/>
+        </w:rPr>
+        <w:t xml:space="preserve">, </w:t>
+      </w:r>
+      <w:proofErr w:type="spellStart"/>
+      <w:r>
+        <w:rPr>
+          <w:lang w:val="es-AR"/>
+        </w:rPr>
+        <w:t>USERELATIONSHIP</w:t>
+      </w:r>
+      <w:proofErr w:type="spellEnd"/>
+      <w:r>
+        <w:rPr>
+          <w:lang w:val="es-AR"/>
+        </w:rPr>
+        <w:t>, VAR/</w:t>
+      </w:r>
+      <w:proofErr w:type="spellStart"/>
+      <w:r>
+        <w:rPr>
+          <w:lang w:val="es-AR"/>
+        </w:rPr>
+        <w:t>RETURN</w:t>
+      </w:r>
+      <w:proofErr w:type="spellEnd"/>
+      <w:r>
+        <w:rPr>
+          <w:lang w:val="es-AR"/>
+        </w:rPr>
+        <w:t xml:space="preserve">, inteligencia de tiempo con </w:t>
+      </w:r>
+      <w:proofErr w:type="spellStart"/>
+      <w:r>
+        <w:rPr>
+          <w:lang w:val="es-AR"/>
+        </w:rPr>
+        <w:t>SAMEPERIODLASTYEAR</w:t>
+      </w:r>
+      <w:proofErr w:type="spellEnd"/>
+      <w:r>
+        <w:rPr>
+          <w:lang w:val="es-AR"/>
+        </w:rPr>
+        <w:t>, y el patrón SWITCH(</w:t>
+      </w:r>
+      <w:proofErr w:type="gramStart"/>
+      <w:r>
+        <w:rPr>
+          <w:lang w:val="es-AR"/>
+        </w:rPr>
+        <w:t>TRUE(</w:t>
+      </w:r>
+      <w:proofErr w:type="gramEnd"/>
+      <w:r>
+        <w:rPr>
+          <w:lang w:val="es-AR"/>
+        </w:rPr>
+        <w:t>)) para segmentación condicional.</w:t>
+      </w:r>
+    </w:p>
+    <w:p>
+      <w:pPr>
+        <w:rPr>
+          <w:lang w:val="es-AR"/>
+        </w:rPr>
+      </w:pPr>
+      <w:r>
+        <w:rPr>
+          <w:lang w:val="es-AR"/>
+        </w:rPr>
+        <w:t xml:space="preserve">Los próximos pasos posibles son: profundizar en el script Python de generación de datos y </w:t>
+      </w:r>
+      <w:proofErr w:type="spellStart"/>
+      <w:r>
+        <w:rPr>
+          <w:lang w:val="es-AR"/>
+        </w:rPr>
+        <w:t>market</w:t>
+      </w:r>
+      <w:proofErr w:type="spellEnd"/>
+      <w:r>
+        <w:rPr>
+          <w:lang w:val="es-AR"/>
+        </w:rPr>
+        <w:t xml:space="preserve"> </w:t>
+      </w:r>
+      <w:proofErr w:type="spellStart"/>
+      <w:r>
+        <w:rPr>
+          <w:lang w:val="es-AR"/>
+        </w:rPr>
+        <w:t>basket</w:t>
+      </w:r>
+      <w:proofErr w:type="spellEnd"/>
+      <w:r>
+        <w:rPr>
+          <w:lang w:val="es-AR"/>
+        </w:rPr>
+        <w:t xml:space="preserve"> </w:t>
+      </w:r>
+      <w:proofErr w:type="spellStart"/>
+      <w:r>
+        <w:rPr>
+          <w:lang w:val="es-AR"/>
+        </w:rPr>
+        <w:t>analysis</w:t>
+      </w:r>
+      <w:proofErr w:type="spellEnd"/>
+      <w:r>
+        <w:rPr>
+          <w:lang w:val="es-AR"/>
+        </w:rPr>
+        <w:t xml:space="preserve">, diseñar el </w:t>
+      </w:r>
+      <w:proofErr w:type="spellStart"/>
+      <w:r>
+        <w:rPr>
+          <w:lang w:val="es-AR"/>
+        </w:rPr>
+        <w:t>layout</w:t>
+      </w:r>
+      <w:proofErr w:type="spellEnd"/>
+      <w:r>
+        <w:rPr>
+          <w:lang w:val="es-AR"/>
+        </w:rPr>
+        <w:t xml:space="preserve"> visual de los </w:t>
+      </w:r>
+      <w:proofErr w:type="spellStart"/>
+      <w:r>
+        <w:rPr>
+          <w:lang w:val="es-AR"/>
+        </w:rPr>
+        <w:t>dashboards</w:t>
+      </w:r>
+      <w:proofErr w:type="spellEnd"/>
+      <w:r>
+        <w:rPr>
+          <w:lang w:val="es-AR"/>
+        </w:rPr>
+        <w:t xml:space="preserve">, o trabajar el </w:t>
+      </w:r>
+      <w:proofErr w:type="spellStart"/>
+      <w:r>
+        <w:rPr>
+          <w:lang w:val="es-AR"/>
+        </w:rPr>
+        <w:t>README</w:t>
+      </w:r>
+      <w:proofErr w:type="spellEnd"/>
+      <w:r>
+        <w:rPr>
+          <w:lang w:val="es-AR"/>
+        </w:rPr>
+        <w:t xml:space="preserve"> y la narrativa de presentación del </w:t>
+      </w:r>
+      <w:proofErr w:type="gramStart"/>
+      <w:r>
+        <w:rPr>
+          <w:lang w:val="es-AR"/>
+        </w:rPr>
+        <w:t>portfolio</w:t>
+      </w:r>
+      <w:proofErr w:type="gramEnd"/>
+      <w:r>
+        <w:rPr>
+          <w:lang w:val="es-AR"/>
+        </w:rPr>
+        <w:t>.</w:t>
+      </w:r>
+    </w:p>
+    <w:p>
+      <w:pPr>
+        <w:rPr>
+          <w:lang w:val="es-AR"/>
+        </w:rPr>
+      </w:pPr>
     </w:p>
     <w:p>
       <w:pPr>

</xml_diff>